<commit_message>
Working on Dart fundamnetals
</commit_message>
<xml_diff>
--- a/flutter_more_documents/f25_flutter_extras_of_basic.docx
+++ b/flutter_more_documents/f25_flutter_extras_of_basic.docx
@@ -15850,14 +15850,43 @@
           <w:szCs w:val="32"/>
         </w:rPr>
       </w:pPr>
-      <w:r>
-        <w:rPr>
-          <w:b/>
-          <w:bCs/>
-          <w:sz w:val="32"/>
-          <w:szCs w:val="32"/>
-        </w:rPr>
-        <w:t>Context Access Concepts (Extra):</w:t>
+      <w:proofErr w:type="spellStart"/>
+      <w:r>
+        <w:rPr>
+          <w:b/>
+          <w:bCs/>
+          <w:sz w:val="32"/>
+          <w:szCs w:val="32"/>
+        </w:rPr>
+        <w:t>Build</w:t>
+      </w:r>
+      <w:r>
+        <w:rPr>
+          <w:b/>
+          <w:bCs/>
+          <w:sz w:val="32"/>
+          <w:szCs w:val="32"/>
+        </w:rPr>
+        <w:t>Context</w:t>
+      </w:r>
+      <w:proofErr w:type="spellEnd"/>
+      <w:r>
+        <w:rPr>
+          <w:b/>
+          <w:bCs/>
+          <w:sz w:val="32"/>
+          <w:szCs w:val="32"/>
+        </w:rPr>
+        <w:t xml:space="preserve"> </w:t>
+      </w:r>
+      <w:r>
+        <w:rPr>
+          <w:b/>
+          <w:bCs/>
+          <w:sz w:val="32"/>
+          <w:szCs w:val="32"/>
+        </w:rPr>
+        <w:t>(Extra):</w:t>
       </w:r>
     </w:p>
     <w:p>
@@ -15875,13 +15904,6 @@
         </w:rPr>
         <w:t xml:space="preserve"># </w:t>
       </w:r>
-      <w:r>
-        <w:rPr>
-          <w:sz w:val="32"/>
-          <w:szCs w:val="32"/>
-        </w:rPr>
-        <w:t xml:space="preserve">In </w:t>
-      </w:r>
       <w:proofErr w:type="spellStart"/>
       <w:r>
         <w:rPr>
@@ -15890,7 +15912,7 @@
           <w:sz w:val="32"/>
           <w:szCs w:val="32"/>
         </w:rPr>
-        <w:t>StatelessWidget</w:t>
+        <w:t>BuildContext</w:t>
       </w:r>
       <w:proofErr w:type="spellEnd"/>
       <w:r>
@@ -15898,6 +15920,107 @@
           <w:sz w:val="32"/>
           <w:szCs w:val="32"/>
         </w:rPr>
+        <w:t xml:space="preserve"> is on object that represents the location of a widget in the widget hierarchy. It’s the location of a Widget in the Element Tree.</w:t>
+      </w:r>
+    </w:p>
+    <w:p>
+      <w:pPr>
+        <w:jc w:val="both"/>
+        <w:rPr>
+          <w:sz w:val="32"/>
+          <w:szCs w:val="32"/>
+        </w:rPr>
+      </w:pPr>
+      <w:r>
+        <w:rPr>
+          <w:sz w:val="32"/>
+          <w:szCs w:val="32"/>
+        </w:rPr>
+        <w:t># It’s used to:</w:t>
+      </w:r>
+    </w:p>
+    <w:p>
+      <w:pPr>
+        <w:pStyle w:val="ListParagraph"/>
+        <w:numPr>
+          <w:ilvl w:val="0"/>
+          <w:numId w:val="47"/>
+        </w:numPr>
+        <w:jc w:val="both"/>
+        <w:rPr>
+          <w:sz w:val="32"/>
+          <w:szCs w:val="32"/>
+        </w:rPr>
+      </w:pPr>
+      <w:r>
+        <w:rPr>
+          <w:sz w:val="32"/>
+          <w:szCs w:val="32"/>
+        </w:rPr>
+        <w:t>Access inherited widgets</w:t>
+      </w:r>
+    </w:p>
+    <w:p>
+      <w:pPr>
+        <w:pStyle w:val="ListParagraph"/>
+        <w:numPr>
+          <w:ilvl w:val="0"/>
+          <w:numId w:val="47"/>
+        </w:numPr>
+        <w:jc w:val="both"/>
+        <w:rPr>
+          <w:sz w:val="32"/>
+          <w:szCs w:val="32"/>
+        </w:rPr>
+      </w:pPr>
+      <w:r>
+        <w:rPr>
+          <w:sz w:val="32"/>
+          <w:szCs w:val="32"/>
+        </w:rPr>
+        <w:t xml:space="preserve">Get </w:t>
+      </w:r>
+      <w:r>
+        <w:rPr>
+          <w:b/>
+          <w:bCs/>
+          <w:sz w:val="32"/>
+          <w:szCs w:val="32"/>
+        </w:rPr>
+        <w:t>Theme</w:t>
+      </w:r>
+      <w:r>
+        <w:rPr>
+          <w:sz w:val="32"/>
+          <w:szCs w:val="32"/>
+        </w:rPr>
+        <w:t>,</w:t>
+      </w:r>
+      <w:r>
+        <w:rPr>
+          <w:b/>
+          <w:bCs/>
+          <w:sz w:val="32"/>
+          <w:szCs w:val="32"/>
+        </w:rPr>
+        <w:t xml:space="preserve"> </w:t>
+      </w:r>
+      <w:proofErr w:type="spellStart"/>
+      <w:r>
+        <w:rPr>
+          <w:b/>
+          <w:bCs/>
+          <w:sz w:val="32"/>
+          <w:szCs w:val="32"/>
+        </w:rPr>
+        <w:t>MediaQuery</w:t>
+      </w:r>
+      <w:proofErr w:type="spellEnd"/>
+      <w:r>
+        <w:rPr>
+          <w:sz w:val="32"/>
+          <w:szCs w:val="32"/>
+        </w:rPr>
         <w:t xml:space="preserve">, </w:t>
       </w:r>
       <w:r>
@@ -15907,50 +16030,67 @@
           <w:sz w:val="32"/>
           <w:szCs w:val="32"/>
         </w:rPr>
-        <w:t>context</w:t>
-      </w:r>
-      <w:r>
-        <w:rPr>
-          <w:sz w:val="32"/>
-          <w:szCs w:val="32"/>
-        </w:rPr>
-        <w:t xml:space="preserve"> is only available in the </w:t>
-      </w:r>
-      <w:proofErr w:type="gramStart"/>
-      <w:r>
-        <w:rPr>
-          <w:b/>
-          <w:bCs/>
-          <w:sz w:val="32"/>
-          <w:szCs w:val="32"/>
-        </w:rPr>
-        <w:t>build(</w:t>
-      </w:r>
-      <w:proofErr w:type="gramEnd"/>
-      <w:r>
-        <w:rPr>
-          <w:b/>
-          <w:bCs/>
-          <w:sz w:val="32"/>
-          <w:szCs w:val="32"/>
-        </w:rPr>
-        <w:t>)</w:t>
-      </w:r>
-      <w:r>
-        <w:rPr>
-          <w:sz w:val="32"/>
-          <w:szCs w:val="32"/>
-        </w:rPr>
-        <w:t xml:space="preserve"> method nowhere else. Not even in the methods (like </w:t>
-      </w:r>
-      <w:r>
-        <w:rPr>
-          <w:b/>
-          <w:bCs/>
-          <w:sz w:val="32"/>
-          <w:szCs w:val="32"/>
-        </w:rPr>
-        <w:t>_</w:t>
+        <w:t>Navigator</w:t>
+      </w:r>
+      <w:r>
+        <w:rPr>
+          <w:sz w:val="32"/>
+          <w:szCs w:val="32"/>
+        </w:rPr>
+        <w:t xml:space="preserve"> etc.</w:t>
+      </w:r>
+    </w:p>
+    <w:p>
+      <w:pPr>
+        <w:pStyle w:val="ListParagraph"/>
+        <w:numPr>
+          <w:ilvl w:val="0"/>
+          <w:numId w:val="47"/>
+        </w:numPr>
+        <w:jc w:val="both"/>
+        <w:rPr>
+          <w:sz w:val="32"/>
+          <w:szCs w:val="32"/>
+        </w:rPr>
+      </w:pPr>
+      <w:r>
+        <w:rPr>
+          <w:sz w:val="32"/>
+          <w:szCs w:val="32"/>
+        </w:rPr>
+        <w:t>Find data above the current widget in the tree</w:t>
+      </w:r>
+    </w:p>
+    <w:p>
+      <w:pPr>
+        <w:jc w:val="both"/>
+        <w:rPr>
+          <w:sz w:val="32"/>
+          <w:szCs w:val="32"/>
+        </w:rPr>
+      </w:pPr>
+      <w:r>
+        <w:rPr>
+          <w:sz w:val="32"/>
+          <w:szCs w:val="32"/>
+        </w:rPr>
+        <w:t># Common Mistakes are using</w:t>
+      </w:r>
+      <w:r>
+        <w:rPr>
+          <w:b/>
+          <w:bCs/>
+          <w:sz w:val="32"/>
+          <w:szCs w:val="32"/>
+        </w:rPr>
+        <w:t xml:space="preserve"> context</w:t>
+      </w:r>
+      <w:r>
+        <w:rPr>
+          <w:sz w:val="32"/>
+          <w:szCs w:val="32"/>
+        </w:rPr>
+        <w:t xml:space="preserve"> too early in </w:t>
       </w:r>
       <w:proofErr w:type="spellStart"/>
       <w:proofErr w:type="gramStart"/>
@@ -15961,7 +16101,7 @@
           <w:sz w:val="32"/>
           <w:szCs w:val="32"/>
         </w:rPr>
-        <w:t>onTap</w:t>
+        <w:t>initState</w:t>
       </w:r>
       <w:proofErr w:type="spellEnd"/>
       <w:r>
@@ -15988,58 +16128,49 @@
           <w:sz w:val="32"/>
           <w:szCs w:val="32"/>
         </w:rPr>
-        <w:t xml:space="preserve">)which are being called from the </w:t>
-      </w:r>
-      <w:r>
-        <w:rPr>
-          <w:b/>
-          <w:bCs/>
-          <w:sz w:val="32"/>
-          <w:szCs w:val="32"/>
-        </w:rPr>
-        <w:t xml:space="preserve">build() </w:t>
-      </w:r>
-      <w:r>
-        <w:rPr>
-          <w:sz w:val="32"/>
-          <w:szCs w:val="32"/>
-        </w:rPr>
-        <w:t>method (unless we pass it as parameter of the function)</w:t>
-      </w:r>
-    </w:p>
-    <w:p>
-      <w:pPr>
-        <w:jc w:val="both"/>
-        <w:rPr>
-          <w:sz w:val="32"/>
-          <w:szCs w:val="32"/>
-        </w:rPr>
-      </w:pPr>
-      <w:r>
-        <w:rPr>
-          <w:sz w:val="32"/>
-          <w:szCs w:val="32"/>
-        </w:rPr>
-        <w:t># But in</w:t>
-      </w:r>
-      <w:r>
-        <w:rPr>
-          <w:b/>
-          <w:bCs/>
-          <w:sz w:val="32"/>
-          <w:szCs w:val="32"/>
-        </w:rPr>
-        <w:t xml:space="preserve"> </w:t>
-      </w:r>
+        <w:t xml:space="preserve"> for inherited dependencies or storing </w:t>
+      </w:r>
+      <w:r>
+        <w:rPr>
+          <w:b/>
+          <w:bCs/>
+          <w:sz w:val="32"/>
+          <w:szCs w:val="32"/>
+        </w:rPr>
+        <w:t xml:space="preserve">context </w:t>
+      </w:r>
+      <w:r>
+        <w:rPr>
+          <w:sz w:val="32"/>
+          <w:szCs w:val="32"/>
+        </w:rPr>
+        <w:t>for too long in service or classes</w:t>
+      </w:r>
+    </w:p>
+    <w:p>
+      <w:pPr>
+        <w:jc w:val="both"/>
+        <w:rPr>
+          <w:sz w:val="32"/>
+          <w:szCs w:val="32"/>
+        </w:rPr>
+      </w:pPr>
+    </w:p>
+    <w:p>
+      <w:pPr>
+        <w:jc w:val="both"/>
+        <w:rPr>
+          <w:sz w:val="32"/>
+          <w:szCs w:val="32"/>
+        </w:rPr>
+      </w:pPr>
       <w:proofErr w:type="spellStart"/>
       <w:r>
         <w:rPr>
-          <w:b/>
-          <w:bCs/>
-          <w:sz w:val="32"/>
-          <w:szCs w:val="32"/>
-        </w:rPr>
-        <w:t>StatefulWidget</w:t>
+          <w:sz w:val="32"/>
+          <w:szCs w:val="32"/>
+        </w:rPr>
+        <w:t>BuidContext</w:t>
       </w:r>
       <w:proofErr w:type="spellEnd"/>
       <w:r>
@@ -16047,6 +16178,47 @@
           <w:sz w:val="32"/>
           <w:szCs w:val="32"/>
         </w:rPr>
+        <w:t xml:space="preserve"> Access Concepts:</w:t>
+      </w:r>
+    </w:p>
+    <w:p>
+      <w:pPr>
+        <w:jc w:val="both"/>
+        <w:rPr>
+          <w:sz w:val="32"/>
+          <w:szCs w:val="32"/>
+        </w:rPr>
+      </w:pPr>
+      <w:r>
+        <w:rPr>
+          <w:sz w:val="32"/>
+          <w:szCs w:val="32"/>
+        </w:rPr>
+        <w:t xml:space="preserve"># </w:t>
+      </w:r>
+      <w:r>
+        <w:rPr>
+          <w:sz w:val="32"/>
+          <w:szCs w:val="32"/>
+        </w:rPr>
+        <w:t xml:space="preserve">In </w:t>
+      </w:r>
+      <w:proofErr w:type="spellStart"/>
+      <w:r>
+        <w:rPr>
+          <w:b/>
+          <w:bCs/>
+          <w:sz w:val="32"/>
+          <w:szCs w:val="32"/>
+        </w:rPr>
+        <w:t>StatelessWidget</w:t>
+      </w:r>
+      <w:proofErr w:type="spellEnd"/>
+      <w:r>
+        <w:rPr>
+          <w:sz w:val="32"/>
+          <w:szCs w:val="32"/>
+        </w:rPr>
         <w:t xml:space="preserve">, </w:t>
       </w:r>
       <w:r>
@@ -16063,7 +16235,7 @@
           <w:sz w:val="32"/>
           <w:szCs w:val="32"/>
         </w:rPr>
-        <w:t xml:space="preserve"> is available in the </w:t>
+        <w:t xml:space="preserve"> is only available in the </w:t>
       </w:r>
       <w:proofErr w:type="gramStart"/>
       <w:r>
@@ -16083,162 +16255,6 @@
           <w:sz w:val="32"/>
           <w:szCs w:val="32"/>
         </w:rPr>
-        <w:t xml:space="preserve">) </w:t>
-      </w:r>
-      <w:r>
-        <w:rPr>
-          <w:sz w:val="32"/>
-          <w:szCs w:val="32"/>
-        </w:rPr>
-        <w:t>method and also in any method (like</w:t>
-      </w:r>
-      <w:r>
-        <w:rPr>
-          <w:b/>
-          <w:bCs/>
-          <w:sz w:val="32"/>
-          <w:szCs w:val="32"/>
-        </w:rPr>
-        <w:t xml:space="preserve"> _</w:t>
-      </w:r>
-      <w:proofErr w:type="spellStart"/>
-      <w:r>
-        <w:rPr>
-          <w:b/>
-          <w:bCs/>
-          <w:sz w:val="32"/>
-          <w:szCs w:val="32"/>
-        </w:rPr>
-        <w:t>onTap</w:t>
-      </w:r>
-      <w:proofErr w:type="spellEnd"/>
-      <w:r>
-        <w:rPr>
-          <w:b/>
-          <w:bCs/>
-          <w:sz w:val="32"/>
-          <w:szCs w:val="32"/>
-        </w:rPr>
-        <w:t xml:space="preserve">() </w:t>
-      </w:r>
-      <w:r>
-        <w:rPr>
-          <w:sz w:val="32"/>
-          <w:szCs w:val="32"/>
-        </w:rPr>
-        <w:t xml:space="preserve">which is called in </w:t>
-      </w:r>
-      <w:r>
-        <w:rPr>
-          <w:b/>
-          <w:bCs/>
-          <w:sz w:val="32"/>
-          <w:szCs w:val="32"/>
-        </w:rPr>
-        <w:t>build()</w:t>
-      </w:r>
-      <w:r>
-        <w:rPr>
-          <w:sz w:val="32"/>
-          <w:szCs w:val="32"/>
-        </w:rPr>
-        <w:t xml:space="preserve">) in the State class. We don’t need to even pass the </w:t>
-      </w:r>
-      <w:proofErr w:type="spellStart"/>
-      <w:r>
-        <w:rPr>
-          <w:b/>
-          <w:bCs/>
-          <w:sz w:val="32"/>
-          <w:szCs w:val="32"/>
-        </w:rPr>
-        <w:t>BuildContext</w:t>
-      </w:r>
-      <w:proofErr w:type="spellEnd"/>
-      <w:r>
-        <w:rPr>
-          <w:sz w:val="32"/>
-          <w:szCs w:val="32"/>
-        </w:rPr>
-        <w:t xml:space="preserve"> as function parameter.</w:t>
-      </w:r>
-    </w:p>
-    <w:p>
-      <w:pPr>
-        <w:jc w:val="both"/>
-        <w:rPr>
-          <w:sz w:val="32"/>
-          <w:szCs w:val="32"/>
-        </w:rPr>
-      </w:pPr>
-      <w:r>
-        <w:rPr>
-          <w:sz w:val="32"/>
-          <w:szCs w:val="32"/>
-        </w:rPr>
-        <w:t xml:space="preserve"># And </w:t>
-      </w:r>
-      <w:r>
-        <w:rPr>
-          <w:b/>
-          <w:bCs/>
-          <w:sz w:val="32"/>
-          <w:szCs w:val="32"/>
-        </w:rPr>
-        <w:t>context</w:t>
-      </w:r>
-      <w:r>
-        <w:rPr>
-          <w:sz w:val="32"/>
-          <w:szCs w:val="32"/>
-        </w:rPr>
-        <w:t xml:space="preserve"> is also available in </w:t>
-      </w:r>
-      <w:proofErr w:type="spellStart"/>
-      <w:r>
-        <w:rPr>
-          <w:b/>
-          <w:bCs/>
-          <w:sz w:val="32"/>
-          <w:szCs w:val="32"/>
-        </w:rPr>
-        <w:t>initState</w:t>
-      </w:r>
-      <w:proofErr w:type="spellEnd"/>
-      <w:r>
-        <w:rPr>
-          <w:sz w:val="32"/>
-          <w:szCs w:val="32"/>
-        </w:rPr>
-        <w:t xml:space="preserve"> and other lifecycle methods. But (VERY IMPORTANT) don’t use context in</w:t>
-      </w:r>
-      <w:r>
-        <w:rPr>
-          <w:b/>
-          <w:bCs/>
-          <w:sz w:val="32"/>
-          <w:szCs w:val="32"/>
-        </w:rPr>
-        <w:t xml:space="preserve"> </w:t>
-      </w:r>
-      <w:proofErr w:type="gramStart"/>
-      <w:r>
-        <w:rPr>
-          <w:b/>
-          <w:bCs/>
-          <w:sz w:val="32"/>
-          <w:szCs w:val="32"/>
-        </w:rPr>
-        <w:t>dispose(</w:t>
-      </w:r>
-      <w:proofErr w:type="gramEnd"/>
-      <w:r>
-        <w:rPr>
-          <w:b/>
-          <w:bCs/>
-          <w:sz w:val="32"/>
-          <w:szCs w:val="32"/>
-        </w:rPr>
         <w:t>)</w:t>
       </w:r>
       <w:r>
@@ -16246,122 +16262,16 @@
           <w:sz w:val="32"/>
           <w:szCs w:val="32"/>
         </w:rPr>
-        <w:t xml:space="preserve"> method because while screen  is disposing </w:t>
-      </w:r>
-      <w:r>
-        <w:rPr>
-          <w:b/>
-          <w:bCs/>
-          <w:sz w:val="32"/>
-          <w:szCs w:val="32"/>
-        </w:rPr>
-        <w:t>context</w:t>
-      </w:r>
-      <w:r>
-        <w:rPr>
-          <w:sz w:val="32"/>
-          <w:szCs w:val="32"/>
-        </w:rPr>
-        <w:t xml:space="preserve"> might not be even available and will throw error</w:t>
-      </w:r>
-    </w:p>
-    <w:p>
-      <w:pPr>
-        <w:jc w:val="both"/>
-        <w:rPr>
-          <w:sz w:val="32"/>
-          <w:szCs w:val="32"/>
-        </w:rPr>
-      </w:pPr>
-    </w:p>
-    <w:p>
-      <w:pPr>
-        <w:jc w:val="both"/>
-        <w:rPr>
-          <w:sz w:val="32"/>
-          <w:szCs w:val="32"/>
-        </w:rPr>
-      </w:pPr>
-    </w:p>
-    <w:p>
-      <w:pPr>
-        <w:jc w:val="both"/>
-        <w:rPr>
-          <w:b/>
-          <w:bCs/>
-          <w:sz w:val="32"/>
-          <w:szCs w:val="32"/>
-        </w:rPr>
-      </w:pPr>
-      <w:r>
-        <w:rPr>
-          <w:b/>
-          <w:bCs/>
-          <w:sz w:val="32"/>
-          <w:szCs w:val="32"/>
-        </w:rPr>
-        <w:t>Color/Size Picker (UI Pattern):</w:t>
-      </w:r>
-    </w:p>
-    <w:p>
-      <w:pPr>
-        <w:jc w:val="both"/>
-        <w:rPr>
-          <w:sz w:val="32"/>
-          <w:szCs w:val="32"/>
-        </w:rPr>
-      </w:pPr>
-      <w:r>
-        <w:rPr>
-          <w:sz w:val="32"/>
-          <w:szCs w:val="32"/>
-        </w:rPr>
-        <w:t xml:space="preserve"># </w:t>
-      </w:r>
-      <w:r>
-        <w:rPr>
-          <w:sz w:val="32"/>
-          <w:szCs w:val="32"/>
-        </w:rPr>
-        <w:t>See f45 advanced UI design doc</w:t>
-      </w:r>
-    </w:p>
-    <w:p>
-      <w:pPr>
-        <w:jc w:val="both"/>
-        <w:rPr>
-          <w:sz w:val="32"/>
-          <w:szCs w:val="32"/>
-        </w:rPr>
-      </w:pPr>
-    </w:p>
-    <w:p>
-      <w:pPr>
-        <w:jc w:val="both"/>
-        <w:rPr>
-          <w:sz w:val="32"/>
-          <w:szCs w:val="32"/>
-        </w:rPr>
-      </w:pPr>
-    </w:p>
-    <w:p>
-      <w:pPr>
-        <w:jc w:val="both"/>
-        <w:rPr>
-          <w:b/>
-          <w:bCs/>
-          <w:sz w:val="32"/>
-          <w:szCs w:val="32"/>
-        </w:rPr>
-      </w:pPr>
-      <w:r>
-        <w:rPr>
-          <w:b/>
-          <w:bCs/>
-          <w:sz w:val="32"/>
-          <w:szCs w:val="32"/>
-        </w:rPr>
-        <w:t xml:space="preserve">Platform Specific Asset Building (In </w:t>
+        <w:t xml:space="preserve"> method nowhere else. Not even in the methods (like </w:t>
+      </w:r>
+      <w:r>
+        <w:rPr>
+          <w:b/>
+          <w:bCs/>
+          <w:sz w:val="32"/>
+          <w:szCs w:val="32"/>
+        </w:rPr>
+        <w:t>_</w:t>
       </w:r>
       <w:proofErr w:type="spellStart"/>
       <w:proofErr w:type="gramStart"/>
@@ -16372,6 +16282,434 @@
           <w:sz w:val="32"/>
           <w:szCs w:val="32"/>
         </w:rPr>
+        <w:t>onTap</w:t>
+      </w:r>
+      <w:proofErr w:type="spellEnd"/>
+      <w:r>
+        <w:rPr>
+          <w:b/>
+          <w:bCs/>
+          <w:sz w:val="32"/>
+          <w:szCs w:val="32"/>
+        </w:rPr>
+        <w:t>(</w:t>
+      </w:r>
+      <w:proofErr w:type="gramEnd"/>
+      <w:r>
+        <w:rPr>
+          <w:b/>
+          <w:bCs/>
+          <w:sz w:val="32"/>
+          <w:szCs w:val="32"/>
+        </w:rPr>
+        <w:t>)</w:t>
+      </w:r>
+      <w:r>
+        <w:rPr>
+          <w:sz w:val="32"/>
+          <w:szCs w:val="32"/>
+        </w:rPr>
+        <w:t xml:space="preserve">)which are being called from the </w:t>
+      </w:r>
+      <w:r>
+        <w:rPr>
+          <w:b/>
+          <w:bCs/>
+          <w:sz w:val="32"/>
+          <w:szCs w:val="32"/>
+        </w:rPr>
+        <w:t xml:space="preserve">build() </w:t>
+      </w:r>
+      <w:r>
+        <w:rPr>
+          <w:sz w:val="32"/>
+          <w:szCs w:val="32"/>
+        </w:rPr>
+        <w:t>method (unless we pass it as parameter of the function)</w:t>
+      </w:r>
+    </w:p>
+    <w:p>
+      <w:pPr>
+        <w:jc w:val="both"/>
+        <w:rPr>
+          <w:sz w:val="32"/>
+          <w:szCs w:val="32"/>
+        </w:rPr>
+      </w:pPr>
+      <w:r>
+        <w:rPr>
+          <w:sz w:val="32"/>
+          <w:szCs w:val="32"/>
+        </w:rPr>
+        <w:t># But in</w:t>
+      </w:r>
+      <w:r>
+        <w:rPr>
+          <w:b/>
+          <w:bCs/>
+          <w:sz w:val="32"/>
+          <w:szCs w:val="32"/>
+        </w:rPr>
+        <w:t xml:space="preserve"> </w:t>
+      </w:r>
+      <w:proofErr w:type="spellStart"/>
+      <w:r>
+        <w:rPr>
+          <w:b/>
+          <w:bCs/>
+          <w:sz w:val="32"/>
+          <w:szCs w:val="32"/>
+        </w:rPr>
+        <w:t>StatefulWidget</w:t>
+      </w:r>
+      <w:proofErr w:type="spellEnd"/>
+      <w:r>
+        <w:rPr>
+          <w:sz w:val="32"/>
+          <w:szCs w:val="32"/>
+        </w:rPr>
+        <w:t xml:space="preserve">, </w:t>
+      </w:r>
+      <w:r>
+        <w:rPr>
+          <w:b/>
+          <w:bCs/>
+          <w:sz w:val="32"/>
+          <w:szCs w:val="32"/>
+        </w:rPr>
+        <w:t>context</w:t>
+      </w:r>
+      <w:r>
+        <w:rPr>
+          <w:sz w:val="32"/>
+          <w:szCs w:val="32"/>
+        </w:rPr>
+        <w:t xml:space="preserve"> is available in the </w:t>
+      </w:r>
+      <w:proofErr w:type="gramStart"/>
+      <w:r>
+        <w:rPr>
+          <w:b/>
+          <w:bCs/>
+          <w:sz w:val="32"/>
+          <w:szCs w:val="32"/>
+        </w:rPr>
+        <w:t>build(</w:t>
+      </w:r>
+      <w:proofErr w:type="gramEnd"/>
+      <w:r>
+        <w:rPr>
+          <w:b/>
+          <w:bCs/>
+          <w:sz w:val="32"/>
+          <w:szCs w:val="32"/>
+        </w:rPr>
+        <w:t xml:space="preserve">) </w:t>
+      </w:r>
+      <w:r>
+        <w:rPr>
+          <w:sz w:val="32"/>
+          <w:szCs w:val="32"/>
+        </w:rPr>
+        <w:t>method and also in any method (like</w:t>
+      </w:r>
+      <w:r>
+        <w:rPr>
+          <w:b/>
+          <w:bCs/>
+          <w:sz w:val="32"/>
+          <w:szCs w:val="32"/>
+        </w:rPr>
+        <w:t xml:space="preserve"> _</w:t>
+      </w:r>
+      <w:proofErr w:type="spellStart"/>
+      <w:r>
+        <w:rPr>
+          <w:b/>
+          <w:bCs/>
+          <w:sz w:val="32"/>
+          <w:szCs w:val="32"/>
+        </w:rPr>
+        <w:t>onTap</w:t>
+      </w:r>
+      <w:proofErr w:type="spellEnd"/>
+      <w:r>
+        <w:rPr>
+          <w:b/>
+          <w:bCs/>
+          <w:sz w:val="32"/>
+          <w:szCs w:val="32"/>
+        </w:rPr>
+        <w:t xml:space="preserve">() </w:t>
+      </w:r>
+      <w:r>
+        <w:rPr>
+          <w:sz w:val="32"/>
+          <w:szCs w:val="32"/>
+        </w:rPr>
+        <w:t xml:space="preserve">which is called in </w:t>
+      </w:r>
+      <w:r>
+        <w:rPr>
+          <w:b/>
+          <w:bCs/>
+          <w:sz w:val="32"/>
+          <w:szCs w:val="32"/>
+        </w:rPr>
+        <w:t>build()</w:t>
+      </w:r>
+      <w:r>
+        <w:rPr>
+          <w:sz w:val="32"/>
+          <w:szCs w:val="32"/>
+        </w:rPr>
+        <w:t xml:space="preserve">) in the State class. We don’t need to even pass the </w:t>
+      </w:r>
+      <w:proofErr w:type="spellStart"/>
+      <w:r>
+        <w:rPr>
+          <w:b/>
+          <w:bCs/>
+          <w:sz w:val="32"/>
+          <w:szCs w:val="32"/>
+        </w:rPr>
+        <w:t>BuildContext</w:t>
+      </w:r>
+      <w:proofErr w:type="spellEnd"/>
+      <w:r>
+        <w:rPr>
+          <w:sz w:val="32"/>
+          <w:szCs w:val="32"/>
+        </w:rPr>
+        <w:t xml:space="preserve"> as function parameter.</w:t>
+      </w:r>
+    </w:p>
+    <w:p>
+      <w:pPr>
+        <w:jc w:val="both"/>
+        <w:rPr>
+          <w:sz w:val="32"/>
+          <w:szCs w:val="32"/>
+        </w:rPr>
+      </w:pPr>
+      <w:r>
+        <w:rPr>
+          <w:sz w:val="32"/>
+          <w:szCs w:val="32"/>
+        </w:rPr>
+        <w:lastRenderedPageBreak/>
+        <w:t xml:space="preserve"># And </w:t>
+      </w:r>
+      <w:r>
+        <w:rPr>
+          <w:b/>
+          <w:bCs/>
+          <w:sz w:val="32"/>
+          <w:szCs w:val="32"/>
+        </w:rPr>
+        <w:t>context</w:t>
+      </w:r>
+      <w:r>
+        <w:rPr>
+          <w:sz w:val="32"/>
+          <w:szCs w:val="32"/>
+        </w:rPr>
+        <w:t xml:space="preserve"> is also available in </w:t>
+      </w:r>
+      <w:proofErr w:type="spellStart"/>
+      <w:r>
+        <w:rPr>
+          <w:b/>
+          <w:bCs/>
+          <w:sz w:val="32"/>
+          <w:szCs w:val="32"/>
+        </w:rPr>
+        <w:t>initState</w:t>
+      </w:r>
+      <w:proofErr w:type="spellEnd"/>
+      <w:r>
+        <w:rPr>
+          <w:sz w:val="32"/>
+          <w:szCs w:val="32"/>
+        </w:rPr>
+        <w:t xml:space="preserve"> and other lifecycle methods. But (VERY IMPORTANT) don’t use context in</w:t>
+      </w:r>
+      <w:r>
+        <w:rPr>
+          <w:b/>
+          <w:bCs/>
+          <w:sz w:val="32"/>
+          <w:szCs w:val="32"/>
+        </w:rPr>
+        <w:t xml:space="preserve"> </w:t>
+      </w:r>
+      <w:proofErr w:type="gramStart"/>
+      <w:r>
+        <w:rPr>
+          <w:b/>
+          <w:bCs/>
+          <w:sz w:val="32"/>
+          <w:szCs w:val="32"/>
+        </w:rPr>
+        <w:t>dispose(</w:t>
+      </w:r>
+      <w:proofErr w:type="gramEnd"/>
+      <w:r>
+        <w:rPr>
+          <w:b/>
+          <w:bCs/>
+          <w:sz w:val="32"/>
+          <w:szCs w:val="32"/>
+        </w:rPr>
+        <w:t>)</w:t>
+      </w:r>
+      <w:r>
+        <w:rPr>
+          <w:sz w:val="32"/>
+          <w:szCs w:val="32"/>
+        </w:rPr>
+        <w:t xml:space="preserve"> method because while screen  is disposing </w:t>
+      </w:r>
+      <w:r>
+        <w:rPr>
+          <w:b/>
+          <w:bCs/>
+          <w:sz w:val="32"/>
+          <w:szCs w:val="32"/>
+        </w:rPr>
+        <w:t>context</w:t>
+      </w:r>
+      <w:r>
+        <w:rPr>
+          <w:sz w:val="32"/>
+          <w:szCs w:val="32"/>
+        </w:rPr>
+        <w:t xml:space="preserve"> might not be even available and will throw error</w:t>
+      </w:r>
+    </w:p>
+    <w:p>
+      <w:pPr>
+        <w:jc w:val="both"/>
+        <w:rPr>
+          <w:sz w:val="32"/>
+          <w:szCs w:val="32"/>
+        </w:rPr>
+      </w:pPr>
+    </w:p>
+    <w:p>
+      <w:pPr>
+        <w:jc w:val="center"/>
+        <w:rPr>
+          <w:sz w:val="32"/>
+          <w:szCs w:val="32"/>
+        </w:rPr>
+      </w:pPr>
+      <w:r>
+        <w:rPr>
+          <w:sz w:val="32"/>
+          <w:szCs w:val="32"/>
+        </w:rPr>
+        <w:t>Break</w:t>
+      </w:r>
+    </w:p>
+    <w:p>
+      <w:pPr>
+        <w:jc w:val="both"/>
+        <w:rPr>
+          <w:sz w:val="32"/>
+          <w:szCs w:val="32"/>
+        </w:rPr>
+      </w:pPr>
+    </w:p>
+    <w:p>
+      <w:pPr>
+        <w:jc w:val="both"/>
+        <w:rPr>
+          <w:b/>
+          <w:bCs/>
+          <w:sz w:val="32"/>
+          <w:szCs w:val="32"/>
+        </w:rPr>
+      </w:pPr>
+      <w:r>
+        <w:rPr>
+          <w:b/>
+          <w:bCs/>
+          <w:sz w:val="32"/>
+          <w:szCs w:val="32"/>
+        </w:rPr>
+        <w:t>Color/Size Picker (UI Pattern):</w:t>
+      </w:r>
+    </w:p>
+    <w:p>
+      <w:pPr>
+        <w:jc w:val="both"/>
+        <w:rPr>
+          <w:sz w:val="32"/>
+          <w:szCs w:val="32"/>
+        </w:rPr>
+      </w:pPr>
+      <w:r>
+        <w:rPr>
+          <w:sz w:val="32"/>
+          <w:szCs w:val="32"/>
+        </w:rPr>
+        <w:t xml:space="preserve"># </w:t>
+      </w:r>
+      <w:r>
+        <w:rPr>
+          <w:sz w:val="32"/>
+          <w:szCs w:val="32"/>
+        </w:rPr>
+        <w:t>See f45 advanced UI design doc</w:t>
+      </w:r>
+    </w:p>
+    <w:p>
+      <w:pPr>
+        <w:jc w:val="both"/>
+        <w:rPr>
+          <w:sz w:val="32"/>
+          <w:szCs w:val="32"/>
+        </w:rPr>
+      </w:pPr>
+    </w:p>
+    <w:p>
+      <w:pPr>
+        <w:jc w:val="both"/>
+        <w:rPr>
+          <w:sz w:val="32"/>
+          <w:szCs w:val="32"/>
+        </w:rPr>
+      </w:pPr>
+    </w:p>
+    <w:p>
+      <w:pPr>
+        <w:jc w:val="both"/>
+        <w:rPr>
+          <w:b/>
+          <w:bCs/>
+          <w:sz w:val="32"/>
+          <w:szCs w:val="32"/>
+        </w:rPr>
+      </w:pPr>
+      <w:r>
+        <w:rPr>
+          <w:b/>
+          <w:bCs/>
+          <w:sz w:val="32"/>
+          <w:szCs w:val="32"/>
+        </w:rPr>
+        <w:t xml:space="preserve">Platform Specific Asset Building (In </w:t>
+      </w:r>
+      <w:proofErr w:type="spellStart"/>
+      <w:proofErr w:type="gramStart"/>
+      <w:r>
+        <w:rPr>
+          <w:b/>
+          <w:bCs/>
+          <w:sz w:val="32"/>
+          <w:szCs w:val="32"/>
+        </w:rPr>
         <w:t>pusec.yaml</w:t>
       </w:r>
       <w:proofErr w:type="spellEnd"/>
@@ -16399,7 +16737,6 @@
           <w:sz w:val="32"/>
           <w:szCs w:val="32"/>
         </w:rPr>
-        <w:lastRenderedPageBreak/>
         <w:t xml:space="preserve"># See f7 build </w:t>
       </w:r>
       <w:proofErr w:type="spellStart"/>
@@ -16646,6 +16983,7 @@
           <w:sz w:val="32"/>
           <w:szCs w:val="32"/>
         </w:rPr>
+        <w:lastRenderedPageBreak/>
         <w:t xml:space="preserve">  'assets/images/banner.jpg',</w:t>
       </w:r>
     </w:p>
@@ -16878,7 +17216,6 @@
           <w:sz w:val="32"/>
           <w:szCs w:val="32"/>
         </w:rPr>
-        <w:lastRenderedPageBreak/>
         <w:t># And image decoding can be expensive especially for:</w:t>
       </w:r>
     </w:p>
@@ -17154,6 +17491,7 @@
           <w:sz w:val="28"/>
           <w:szCs w:val="28"/>
         </w:rPr>
+        <w:lastRenderedPageBreak/>
         <w:t>Image appears</w:t>
       </w:r>
     </w:p>
@@ -17389,7 +17727,6 @@
           <w:sz w:val="32"/>
           <w:szCs w:val="32"/>
         </w:rPr>
-        <w:lastRenderedPageBreak/>
         <w:t># With precaching:</w:t>
       </w:r>
     </w:p>
@@ -17689,6 +18026,7 @@
           <w:sz w:val="32"/>
           <w:szCs w:val="32"/>
         </w:rPr>
+        <w:lastRenderedPageBreak/>
         <w:t>AssetImage</w:t>
       </w:r>
       <w:proofErr w:type="spellEnd"/>
@@ -18067,7 +18405,6 @@
           <w:sz w:val="32"/>
           <w:szCs w:val="32"/>
         </w:rPr>
-        <w:lastRenderedPageBreak/>
         <w:t xml:space="preserve">  context,</w:t>
       </w:r>
     </w:p>
@@ -18429,6 +18766,7 @@
           <w:sz w:val="32"/>
           <w:szCs w:val="32"/>
         </w:rPr>
+        <w:lastRenderedPageBreak/>
         <w:t xml:space="preserve">#Here, </w:t>
       </w:r>
       <w:proofErr w:type="spellStart"/>
@@ -18770,7 +19108,6 @@
           <w:sz w:val="32"/>
           <w:szCs w:val="32"/>
         </w:rPr>
-        <w:lastRenderedPageBreak/>
         <w:t>class _</w:t>
       </w:r>
       <w:proofErr w:type="spellStart"/>
@@ -19241,6 +19578,7 @@
           <w:sz w:val="32"/>
           <w:szCs w:val="32"/>
         </w:rPr>
+        <w:lastRenderedPageBreak/>
         <w:t xml:space="preserve">    return const </w:t>
       </w:r>
       <w:proofErr w:type="gramStart"/>
@@ -19520,7 +19858,6 @@
           <w:sz w:val="28"/>
           <w:szCs w:val="28"/>
         </w:rPr>
-        <w:lastRenderedPageBreak/>
         <w:t>Open page</w:t>
       </w:r>
     </w:p>
@@ -19797,6 +20134,7 @@
           <w:sz w:val="28"/>
           <w:szCs w:val="28"/>
         </w:rPr>
+        <w:lastRenderedPageBreak/>
         <w:t>Store cache</w:t>
       </w:r>
     </w:p>
@@ -20087,7 +20425,6 @@
           <w:sz w:val="32"/>
           <w:szCs w:val="32"/>
         </w:rPr>
-        <w:lastRenderedPageBreak/>
         <w:t xml:space="preserve">    </w:t>
       </w:r>
       <w:proofErr w:type="spellStart"/>
@@ -20437,6 +20774,7 @@
           <w:sz w:val="32"/>
           <w:szCs w:val="32"/>
         </w:rPr>
+        <w:lastRenderedPageBreak/>
         <w:t># This is a real production use case. Suppose the detail page has a huge product image:</w:t>
       </w:r>
     </w:p>
@@ -20619,7 +20957,6 @@
           <w:sz w:val="32"/>
           <w:szCs w:val="32"/>
         </w:rPr>
-        <w:lastRenderedPageBreak/>
         <w:t xml:space="preserve"># Use </w:t>
       </w:r>
       <w:proofErr w:type="spellStart"/>
@@ -20943,6 +21280,7 @@
           <w:sz w:val="32"/>
           <w:szCs w:val="32"/>
         </w:rPr>
+        <w:lastRenderedPageBreak/>
         <w:t>Long startup time</w:t>
       </w:r>
     </w:p>
@@ -21253,7 +21591,6 @@
           <w:sz w:val="32"/>
           <w:szCs w:val="32"/>
         </w:rPr>
-        <w:lastRenderedPageBreak/>
         <w:t>Hero images</w:t>
       </w:r>
     </w:p>
@@ -21627,6 +21964,7 @@
           <w:sz w:val="32"/>
           <w:szCs w:val="32"/>
         </w:rPr>
+        <w:lastRenderedPageBreak/>
         <w:t xml:space="preserve">const </w:t>
       </w:r>
       <w:proofErr w:type="gramStart"/>
@@ -21995,7 +22333,6 @@
           <w:sz w:val="32"/>
           <w:szCs w:val="32"/>
         </w:rPr>
-        <w:lastRenderedPageBreak/>
         <w:t xml:space="preserve">include: </w:t>
       </w:r>
       <w:proofErr w:type="spellStart"/>
@@ -22484,7 +22821,6 @@
           <w:sz w:val="32"/>
           <w:szCs w:val="32"/>
         </w:rPr>
-        <w:lastRenderedPageBreak/>
         <w:t>designer.flutterflow.io</w:t>
       </w:r>
     </w:p>
@@ -22710,6 +23046,7 @@
           <w:sz w:val="32"/>
           <w:szCs w:val="32"/>
         </w:rPr>
+        <w:lastRenderedPageBreak/>
         <w:t xml:space="preserve">State Management like </w:t>
       </w:r>
       <w:r>
@@ -23022,10 +23359,246 @@
     </w:p>
     <w:p>
       <w:pPr>
-        <w:jc w:val="both"/>
-        <w:rPr>
-          <w:b/>
-          <w:bCs/>
+        <w:jc w:val="center"/>
+        <w:rPr>
+          <w:sz w:val="32"/>
+          <w:szCs w:val="32"/>
+        </w:rPr>
+      </w:pPr>
+      <w:r>
+        <w:rPr>
+          <w:sz w:val="32"/>
+          <w:szCs w:val="32"/>
+        </w:rPr>
+        <w:t>Break</w:t>
+      </w:r>
+    </w:p>
+    <w:p>
+      <w:pPr>
+        <w:jc w:val="both"/>
+        <w:rPr>
+          <w:b/>
+          <w:bCs/>
+          <w:sz w:val="32"/>
+          <w:szCs w:val="32"/>
+        </w:rPr>
+      </w:pPr>
+    </w:p>
+    <w:p>
+      <w:pPr>
+        <w:jc w:val="both"/>
+        <w:rPr>
+          <w:b/>
+          <w:bCs/>
+          <w:sz w:val="32"/>
+          <w:szCs w:val="32"/>
+        </w:rPr>
+      </w:pPr>
+      <w:r>
+        <w:rPr>
+          <w:b/>
+          <w:bCs/>
+          <w:sz w:val="32"/>
+          <w:szCs w:val="32"/>
+        </w:rPr>
+        <w:t>Premium Flutter Packages:</w:t>
+      </w:r>
+    </w:p>
+    <w:p>
+      <w:pPr>
+        <w:jc w:val="both"/>
+        <w:rPr>
+          <w:sz w:val="32"/>
+          <w:szCs w:val="32"/>
+        </w:rPr>
+      </w:pPr>
+      <w:r>
+        <w:rPr>
+          <w:sz w:val="32"/>
+          <w:szCs w:val="32"/>
+        </w:rPr>
+        <w:t># Like:</w:t>
+      </w:r>
+    </w:p>
+    <w:p>
+      <w:pPr>
+        <w:pStyle w:val="ListParagraph"/>
+        <w:numPr>
+          <w:ilvl w:val="0"/>
+          <w:numId w:val="48"/>
+        </w:numPr>
+        <w:jc w:val="both"/>
+        <w:rPr>
+          <w:sz w:val="32"/>
+          <w:szCs w:val="32"/>
+        </w:rPr>
+      </w:pPr>
+      <w:r>
+        <w:rPr>
+          <w:sz w:val="32"/>
+          <w:szCs w:val="32"/>
+        </w:rPr>
+        <w:t>Animate</w:t>
+      </w:r>
+      <w:r>
+        <w:rPr>
+          <w:sz w:val="32"/>
+          <w:szCs w:val="32"/>
+        </w:rPr>
+        <w:t xml:space="preserve"> </w:t>
+      </w:r>
+      <w:r>
+        <w:rPr>
+          <w:sz w:val="32"/>
+          <w:szCs w:val="32"/>
+        </w:rPr>
+        <w:t>Do</w:t>
+      </w:r>
+    </w:p>
+    <w:p>
+      <w:pPr>
+        <w:pStyle w:val="ListParagraph"/>
+        <w:numPr>
+          <w:ilvl w:val="0"/>
+          <w:numId w:val="48"/>
+        </w:numPr>
+        <w:jc w:val="both"/>
+        <w:rPr>
+          <w:sz w:val="32"/>
+          <w:szCs w:val="32"/>
+        </w:rPr>
+      </w:pPr>
+      <w:r>
+        <w:rPr>
+          <w:sz w:val="32"/>
+          <w:szCs w:val="32"/>
+        </w:rPr>
+        <w:t>Responsive Framework</w:t>
+      </w:r>
+    </w:p>
+    <w:p>
+      <w:pPr>
+        <w:pStyle w:val="ListParagraph"/>
+        <w:numPr>
+          <w:ilvl w:val="0"/>
+          <w:numId w:val="48"/>
+        </w:numPr>
+        <w:jc w:val="both"/>
+        <w:rPr>
+          <w:sz w:val="32"/>
+          <w:szCs w:val="32"/>
+        </w:rPr>
+      </w:pPr>
+      <w:r>
+        <w:rPr>
+          <w:sz w:val="32"/>
+          <w:szCs w:val="32"/>
+        </w:rPr>
+        <w:t>Slidable</w:t>
+      </w:r>
+    </w:p>
+    <w:p>
+      <w:pPr>
+        <w:pStyle w:val="ListParagraph"/>
+        <w:numPr>
+          <w:ilvl w:val="0"/>
+          <w:numId w:val="48"/>
+        </w:numPr>
+        <w:jc w:val="both"/>
+        <w:rPr>
+          <w:sz w:val="32"/>
+          <w:szCs w:val="32"/>
+        </w:rPr>
+      </w:pPr>
+      <w:r>
+        <w:rPr>
+          <w:sz w:val="32"/>
+          <w:szCs w:val="32"/>
+        </w:rPr>
+        <w:t>Parallax</w:t>
+      </w:r>
+    </w:p>
+    <w:p>
+      <w:pPr>
+        <w:pStyle w:val="ListParagraph"/>
+        <w:numPr>
+          <w:ilvl w:val="0"/>
+          <w:numId w:val="48"/>
+        </w:numPr>
+        <w:jc w:val="both"/>
+        <w:rPr>
+          <w:sz w:val="32"/>
+          <w:szCs w:val="32"/>
+        </w:rPr>
+      </w:pPr>
+      <w:r>
+        <w:rPr>
+          <w:sz w:val="32"/>
+          <w:szCs w:val="32"/>
+        </w:rPr>
+        <w:t>Glass</w:t>
+      </w:r>
+    </w:p>
+    <w:p>
+      <w:pPr>
+        <w:pStyle w:val="ListParagraph"/>
+        <w:numPr>
+          <w:ilvl w:val="0"/>
+          <w:numId w:val="48"/>
+        </w:numPr>
+        <w:jc w:val="both"/>
+        <w:rPr>
+          <w:sz w:val="32"/>
+          <w:szCs w:val="32"/>
+        </w:rPr>
+      </w:pPr>
+      <w:r>
+        <w:rPr>
+          <w:sz w:val="32"/>
+          <w:szCs w:val="32"/>
+        </w:rPr>
+        <w:t>Shimmer</w:t>
+      </w:r>
+    </w:p>
+    <w:p>
+      <w:pPr>
+        <w:pStyle w:val="ListParagraph"/>
+        <w:numPr>
+          <w:ilvl w:val="0"/>
+          <w:numId w:val="48"/>
+        </w:numPr>
+        <w:jc w:val="both"/>
+        <w:rPr>
+          <w:sz w:val="32"/>
+          <w:szCs w:val="32"/>
+        </w:rPr>
+      </w:pPr>
+      <w:r>
+        <w:rPr>
+          <w:sz w:val="32"/>
+          <w:szCs w:val="32"/>
+        </w:rPr>
+        <w:t>Photo</w:t>
+      </w:r>
+      <w:r>
+        <w:rPr>
+          <w:sz w:val="32"/>
+          <w:szCs w:val="32"/>
+        </w:rPr>
+        <w:t xml:space="preserve"> </w:t>
+      </w:r>
+      <w:r>
+        <w:rPr>
+          <w:sz w:val="32"/>
+          <w:szCs w:val="32"/>
+        </w:rPr>
+        <w:t>View</w:t>
+      </w:r>
+    </w:p>
+    <w:p>
+      <w:pPr>
+        <w:jc w:val="both"/>
+        <w:rPr>
           <w:sz w:val="32"/>
           <w:szCs w:val="32"/>
         </w:rPr>
@@ -23862,6 +24435,119 @@
     </w:lvl>
   </w:abstractNum>
   <w:abstractNum w:abstractNumId="6" w15:restartNumberingAfterBreak="0">
+    <w:nsid w:val="0DE12E99"/>
+    <w:multiLevelType w:val="hybridMultilevel"/>
+    <w:tmpl w:val="DE003980"/>
+    <w:lvl w:ilvl="0" w:tplc="04090001">
+      <w:start w:val="1"/>
+      <w:numFmt w:val="bullet"/>
+      <w:lvlText w:val=""/>
+      <w:lvlJc w:val="left"/>
+      <w:pPr>
+        <w:ind w:left="360" w:hanging="360"/>
+      </w:pPr>
+      <w:rPr>
+        <w:rFonts w:ascii="Symbol" w:hAnsi="Symbol" w:hint="default"/>
+      </w:rPr>
+    </w:lvl>
+    <w:lvl w:ilvl="1" w:tplc="04090003" w:tentative="1">
+      <w:start w:val="1"/>
+      <w:numFmt w:val="bullet"/>
+      <w:lvlText w:val="o"/>
+      <w:lvlJc w:val="left"/>
+      <w:pPr>
+        <w:ind w:left="1080" w:hanging="360"/>
+      </w:pPr>
+      <w:rPr>
+        <w:rFonts w:ascii="Courier New" w:hAnsi="Courier New" w:cs="Courier New" w:hint="default"/>
+      </w:rPr>
+    </w:lvl>
+    <w:lvl w:ilvl="2" w:tplc="04090005" w:tentative="1">
+      <w:start w:val="1"/>
+      <w:numFmt w:val="bullet"/>
+      <w:lvlText w:val=""/>
+      <w:lvlJc w:val="left"/>
+      <w:pPr>
+        <w:ind w:left="1800" w:hanging="360"/>
+      </w:pPr>
+      <w:rPr>
+        <w:rFonts w:ascii="Wingdings" w:hAnsi="Wingdings" w:hint="default"/>
+      </w:rPr>
+    </w:lvl>
+    <w:lvl w:ilvl="3" w:tplc="04090001" w:tentative="1">
+      <w:start w:val="1"/>
+      <w:numFmt w:val="bullet"/>
+      <w:lvlText w:val=""/>
+      <w:lvlJc w:val="left"/>
+      <w:pPr>
+        <w:ind w:left="2520" w:hanging="360"/>
+      </w:pPr>
+      <w:rPr>
+        <w:rFonts w:ascii="Symbol" w:hAnsi="Symbol" w:hint="default"/>
+      </w:rPr>
+    </w:lvl>
+    <w:lvl w:ilvl="4" w:tplc="04090003" w:tentative="1">
+      <w:start w:val="1"/>
+      <w:numFmt w:val="bullet"/>
+      <w:lvlText w:val="o"/>
+      <w:lvlJc w:val="left"/>
+      <w:pPr>
+        <w:ind w:left="3240" w:hanging="360"/>
+      </w:pPr>
+      <w:rPr>
+        <w:rFonts w:ascii="Courier New" w:hAnsi="Courier New" w:cs="Courier New" w:hint="default"/>
+      </w:rPr>
+    </w:lvl>
+    <w:lvl w:ilvl="5" w:tplc="04090005" w:tentative="1">
+      <w:start w:val="1"/>
+      <w:numFmt w:val="bullet"/>
+      <w:lvlText w:val=""/>
+      <w:lvlJc w:val="left"/>
+      <w:pPr>
+        <w:ind w:left="3960" w:hanging="360"/>
+      </w:pPr>
+      <w:rPr>
+        <w:rFonts w:ascii="Wingdings" w:hAnsi="Wingdings" w:hint="default"/>
+      </w:rPr>
+    </w:lvl>
+    <w:lvl w:ilvl="6" w:tplc="04090001" w:tentative="1">
+      <w:start w:val="1"/>
+      <w:numFmt w:val="bullet"/>
+      <w:lvlText w:val=""/>
+      <w:lvlJc w:val="left"/>
+      <w:pPr>
+        <w:ind w:left="4680" w:hanging="360"/>
+      </w:pPr>
+      <w:rPr>
+        <w:rFonts w:ascii="Symbol" w:hAnsi="Symbol" w:hint="default"/>
+      </w:rPr>
+    </w:lvl>
+    <w:lvl w:ilvl="7" w:tplc="04090003" w:tentative="1">
+      <w:start w:val="1"/>
+      <w:numFmt w:val="bullet"/>
+      <w:lvlText w:val="o"/>
+      <w:lvlJc w:val="left"/>
+      <w:pPr>
+        <w:ind w:left="5400" w:hanging="360"/>
+      </w:pPr>
+      <w:rPr>
+        <w:rFonts w:ascii="Courier New" w:hAnsi="Courier New" w:cs="Courier New" w:hint="default"/>
+      </w:rPr>
+    </w:lvl>
+    <w:lvl w:ilvl="8" w:tplc="04090005" w:tentative="1">
+      <w:start w:val="1"/>
+      <w:numFmt w:val="bullet"/>
+      <w:lvlText w:val=""/>
+      <w:lvlJc w:val="left"/>
+      <w:pPr>
+        <w:ind w:left="6120" w:hanging="360"/>
+      </w:pPr>
+      <w:rPr>
+        <w:rFonts w:ascii="Wingdings" w:hAnsi="Wingdings" w:hint="default"/>
+      </w:rPr>
+    </w:lvl>
+  </w:abstractNum>
+  <w:abstractNum w:abstractNumId="7" w15:restartNumberingAfterBreak="0">
     <w:nsid w:val="0F5C63EE"/>
     <w:multiLevelType w:val="hybridMultilevel"/>
     <w:tmpl w:val="C9B4A58E"/>
@@ -23974,7 +24660,7 @@
       </w:rPr>
     </w:lvl>
   </w:abstractNum>
-  <w:abstractNum w:abstractNumId="7" w15:restartNumberingAfterBreak="0">
+  <w:abstractNum w:abstractNumId="8" w15:restartNumberingAfterBreak="0">
     <w:nsid w:val="12E0605E"/>
     <w:multiLevelType w:val="hybridMultilevel"/>
     <w:tmpl w:val="93CA4FD4"/>
@@ -24087,7 +24773,7 @@
       </w:rPr>
     </w:lvl>
   </w:abstractNum>
-  <w:abstractNum w:abstractNumId="8" w15:restartNumberingAfterBreak="0">
+  <w:abstractNum w:abstractNumId="9" w15:restartNumberingAfterBreak="0">
     <w:nsid w:val="1902169D"/>
     <w:multiLevelType w:val="hybridMultilevel"/>
     <w:tmpl w:val="94EA68F8"/>
@@ -24200,7 +24886,7 @@
       </w:rPr>
     </w:lvl>
   </w:abstractNum>
-  <w:abstractNum w:abstractNumId="9" w15:restartNumberingAfterBreak="0">
+  <w:abstractNum w:abstractNumId="10" w15:restartNumberingAfterBreak="0">
     <w:nsid w:val="23081385"/>
     <w:multiLevelType w:val="hybridMultilevel"/>
     <w:tmpl w:val="37FC427A"/>
@@ -24313,7 +24999,7 @@
       </w:rPr>
     </w:lvl>
   </w:abstractNum>
-  <w:abstractNum w:abstractNumId="10" w15:restartNumberingAfterBreak="0">
+  <w:abstractNum w:abstractNumId="11" w15:restartNumberingAfterBreak="0">
     <w:nsid w:val="29B24A28"/>
     <w:multiLevelType w:val="hybridMultilevel"/>
     <w:tmpl w:val="32B6DBA6"/>
@@ -24426,7 +25112,7 @@
       </w:rPr>
     </w:lvl>
   </w:abstractNum>
-  <w:abstractNum w:abstractNumId="11" w15:restartNumberingAfterBreak="0">
+  <w:abstractNum w:abstractNumId="12" w15:restartNumberingAfterBreak="0">
     <w:nsid w:val="2C002516"/>
     <w:multiLevelType w:val="hybridMultilevel"/>
     <w:tmpl w:val="F92A5D5C"/>
@@ -24539,7 +25225,7 @@
       </w:rPr>
     </w:lvl>
   </w:abstractNum>
-  <w:abstractNum w:abstractNumId="12" w15:restartNumberingAfterBreak="0">
+  <w:abstractNum w:abstractNumId="13" w15:restartNumberingAfterBreak="0">
     <w:nsid w:val="2C2F3459"/>
     <w:multiLevelType w:val="hybridMultilevel"/>
     <w:tmpl w:val="FAA2CF4A"/>
@@ -24652,7 +25338,7 @@
       </w:rPr>
     </w:lvl>
   </w:abstractNum>
-  <w:abstractNum w:abstractNumId="13" w15:restartNumberingAfterBreak="0">
+  <w:abstractNum w:abstractNumId="14" w15:restartNumberingAfterBreak="0">
     <w:nsid w:val="2D2C3643"/>
     <w:multiLevelType w:val="hybridMultilevel"/>
     <w:tmpl w:val="BCD27808"/>
@@ -24765,7 +25451,7 @@
       </w:rPr>
     </w:lvl>
   </w:abstractNum>
-  <w:abstractNum w:abstractNumId="14" w15:restartNumberingAfterBreak="0">
+  <w:abstractNum w:abstractNumId="15" w15:restartNumberingAfterBreak="0">
     <w:nsid w:val="2F550569"/>
     <w:multiLevelType w:val="hybridMultilevel"/>
     <w:tmpl w:val="8D6012B4"/>
@@ -24878,7 +25564,7 @@
       </w:rPr>
     </w:lvl>
   </w:abstractNum>
-  <w:abstractNum w:abstractNumId="15" w15:restartNumberingAfterBreak="0">
+  <w:abstractNum w:abstractNumId="16" w15:restartNumberingAfterBreak="0">
     <w:nsid w:val="2FE06FE8"/>
     <w:multiLevelType w:val="hybridMultilevel"/>
     <w:tmpl w:val="F0883B9E"/>
@@ -24991,7 +25677,120 @@
       </w:rPr>
     </w:lvl>
   </w:abstractNum>
-  <w:abstractNum w:abstractNumId="16" w15:restartNumberingAfterBreak="0">
+  <w:abstractNum w:abstractNumId="17" w15:restartNumberingAfterBreak="0">
+    <w:nsid w:val="33FB68E2"/>
+    <w:multiLevelType w:val="hybridMultilevel"/>
+    <w:tmpl w:val="C6F67506"/>
+    <w:lvl w:ilvl="0" w:tplc="04090001">
+      <w:start w:val="1"/>
+      <w:numFmt w:val="bullet"/>
+      <w:lvlText w:val=""/>
+      <w:lvlJc w:val="left"/>
+      <w:pPr>
+        <w:ind w:left="360" w:hanging="360"/>
+      </w:pPr>
+      <w:rPr>
+        <w:rFonts w:ascii="Symbol" w:hAnsi="Symbol" w:hint="default"/>
+      </w:rPr>
+    </w:lvl>
+    <w:lvl w:ilvl="1" w:tplc="04090003" w:tentative="1">
+      <w:start w:val="1"/>
+      <w:numFmt w:val="bullet"/>
+      <w:lvlText w:val="o"/>
+      <w:lvlJc w:val="left"/>
+      <w:pPr>
+        <w:ind w:left="1080" w:hanging="360"/>
+      </w:pPr>
+      <w:rPr>
+        <w:rFonts w:ascii="Courier New" w:hAnsi="Courier New" w:cs="Courier New" w:hint="default"/>
+      </w:rPr>
+    </w:lvl>
+    <w:lvl w:ilvl="2" w:tplc="04090005" w:tentative="1">
+      <w:start w:val="1"/>
+      <w:numFmt w:val="bullet"/>
+      <w:lvlText w:val=""/>
+      <w:lvlJc w:val="left"/>
+      <w:pPr>
+        <w:ind w:left="1800" w:hanging="360"/>
+      </w:pPr>
+      <w:rPr>
+        <w:rFonts w:ascii="Wingdings" w:hAnsi="Wingdings" w:hint="default"/>
+      </w:rPr>
+    </w:lvl>
+    <w:lvl w:ilvl="3" w:tplc="04090001" w:tentative="1">
+      <w:start w:val="1"/>
+      <w:numFmt w:val="bullet"/>
+      <w:lvlText w:val=""/>
+      <w:lvlJc w:val="left"/>
+      <w:pPr>
+        <w:ind w:left="2520" w:hanging="360"/>
+      </w:pPr>
+      <w:rPr>
+        <w:rFonts w:ascii="Symbol" w:hAnsi="Symbol" w:hint="default"/>
+      </w:rPr>
+    </w:lvl>
+    <w:lvl w:ilvl="4" w:tplc="04090003" w:tentative="1">
+      <w:start w:val="1"/>
+      <w:numFmt w:val="bullet"/>
+      <w:lvlText w:val="o"/>
+      <w:lvlJc w:val="left"/>
+      <w:pPr>
+        <w:ind w:left="3240" w:hanging="360"/>
+      </w:pPr>
+      <w:rPr>
+        <w:rFonts w:ascii="Courier New" w:hAnsi="Courier New" w:cs="Courier New" w:hint="default"/>
+      </w:rPr>
+    </w:lvl>
+    <w:lvl w:ilvl="5" w:tplc="04090005" w:tentative="1">
+      <w:start w:val="1"/>
+      <w:numFmt w:val="bullet"/>
+      <w:lvlText w:val=""/>
+      <w:lvlJc w:val="left"/>
+      <w:pPr>
+        <w:ind w:left="3960" w:hanging="360"/>
+      </w:pPr>
+      <w:rPr>
+        <w:rFonts w:ascii="Wingdings" w:hAnsi="Wingdings" w:hint="default"/>
+      </w:rPr>
+    </w:lvl>
+    <w:lvl w:ilvl="6" w:tplc="04090001" w:tentative="1">
+      <w:start w:val="1"/>
+      <w:numFmt w:val="bullet"/>
+      <w:lvlText w:val=""/>
+      <w:lvlJc w:val="left"/>
+      <w:pPr>
+        <w:ind w:left="4680" w:hanging="360"/>
+      </w:pPr>
+      <w:rPr>
+        <w:rFonts w:ascii="Symbol" w:hAnsi="Symbol" w:hint="default"/>
+      </w:rPr>
+    </w:lvl>
+    <w:lvl w:ilvl="7" w:tplc="04090003" w:tentative="1">
+      <w:start w:val="1"/>
+      <w:numFmt w:val="bullet"/>
+      <w:lvlText w:val="o"/>
+      <w:lvlJc w:val="left"/>
+      <w:pPr>
+        <w:ind w:left="5400" w:hanging="360"/>
+      </w:pPr>
+      <w:rPr>
+        <w:rFonts w:ascii="Courier New" w:hAnsi="Courier New" w:cs="Courier New" w:hint="default"/>
+      </w:rPr>
+    </w:lvl>
+    <w:lvl w:ilvl="8" w:tplc="04090005" w:tentative="1">
+      <w:start w:val="1"/>
+      <w:numFmt w:val="bullet"/>
+      <w:lvlText w:val=""/>
+      <w:lvlJc w:val="left"/>
+      <w:pPr>
+        <w:ind w:left="6120" w:hanging="360"/>
+      </w:pPr>
+      <w:rPr>
+        <w:rFonts w:ascii="Wingdings" w:hAnsi="Wingdings" w:hint="default"/>
+      </w:rPr>
+    </w:lvl>
+  </w:abstractNum>
+  <w:abstractNum w:abstractNumId="18" w15:restartNumberingAfterBreak="0">
     <w:nsid w:val="358A2910"/>
     <w:multiLevelType w:val="hybridMultilevel"/>
     <w:tmpl w:val="224034A8"/>
@@ -25104,7 +25903,7 @@
       </w:rPr>
     </w:lvl>
   </w:abstractNum>
-  <w:abstractNum w:abstractNumId="17" w15:restartNumberingAfterBreak="0">
+  <w:abstractNum w:abstractNumId="19" w15:restartNumberingAfterBreak="0">
     <w:nsid w:val="35CC1B49"/>
     <w:multiLevelType w:val="hybridMultilevel"/>
     <w:tmpl w:val="D2720906"/>
@@ -25217,7 +26016,7 @@
       </w:rPr>
     </w:lvl>
   </w:abstractNum>
-  <w:abstractNum w:abstractNumId="18" w15:restartNumberingAfterBreak="0">
+  <w:abstractNum w:abstractNumId="20" w15:restartNumberingAfterBreak="0">
     <w:nsid w:val="37476265"/>
     <w:multiLevelType w:val="hybridMultilevel"/>
     <w:tmpl w:val="129E8676"/>
@@ -25330,7 +26129,7 @@
       </w:rPr>
     </w:lvl>
   </w:abstractNum>
-  <w:abstractNum w:abstractNumId="19" w15:restartNumberingAfterBreak="0">
+  <w:abstractNum w:abstractNumId="21" w15:restartNumberingAfterBreak="0">
     <w:nsid w:val="379808DE"/>
     <w:multiLevelType w:val="hybridMultilevel"/>
     <w:tmpl w:val="C0EE2048"/>
@@ -25443,7 +26242,7 @@
       </w:rPr>
     </w:lvl>
   </w:abstractNum>
-  <w:abstractNum w:abstractNumId="20" w15:restartNumberingAfterBreak="0">
+  <w:abstractNum w:abstractNumId="22" w15:restartNumberingAfterBreak="0">
     <w:nsid w:val="3AF5136D"/>
     <w:multiLevelType w:val="hybridMultilevel"/>
     <w:tmpl w:val="EBA82A72"/>
@@ -25556,7 +26355,7 @@
       </w:rPr>
     </w:lvl>
   </w:abstractNum>
-  <w:abstractNum w:abstractNumId="21" w15:restartNumberingAfterBreak="0">
+  <w:abstractNum w:abstractNumId="23" w15:restartNumberingAfterBreak="0">
     <w:nsid w:val="3B056133"/>
     <w:multiLevelType w:val="hybridMultilevel"/>
     <w:tmpl w:val="756C256C"/>
@@ -25669,7 +26468,7 @@
       </w:rPr>
     </w:lvl>
   </w:abstractNum>
-  <w:abstractNum w:abstractNumId="22" w15:restartNumberingAfterBreak="0">
+  <w:abstractNum w:abstractNumId="24" w15:restartNumberingAfterBreak="0">
     <w:nsid w:val="431836C6"/>
     <w:multiLevelType w:val="hybridMultilevel"/>
     <w:tmpl w:val="28CA1800"/>
@@ -25782,7 +26581,7 @@
       </w:rPr>
     </w:lvl>
   </w:abstractNum>
-  <w:abstractNum w:abstractNumId="23" w15:restartNumberingAfterBreak="0">
+  <w:abstractNum w:abstractNumId="25" w15:restartNumberingAfterBreak="0">
     <w:nsid w:val="44024354"/>
     <w:multiLevelType w:val="hybridMultilevel"/>
     <w:tmpl w:val="5970B644"/>
@@ -25895,7 +26694,7 @@
       </w:rPr>
     </w:lvl>
   </w:abstractNum>
-  <w:abstractNum w:abstractNumId="24" w15:restartNumberingAfterBreak="0">
+  <w:abstractNum w:abstractNumId="26" w15:restartNumberingAfterBreak="0">
     <w:nsid w:val="480C411D"/>
     <w:multiLevelType w:val="hybridMultilevel"/>
     <w:tmpl w:val="7388BA3C"/>
@@ -26008,7 +26807,7 @@
       </w:rPr>
     </w:lvl>
   </w:abstractNum>
-  <w:abstractNum w:abstractNumId="25" w15:restartNumberingAfterBreak="0">
+  <w:abstractNum w:abstractNumId="27" w15:restartNumberingAfterBreak="0">
     <w:nsid w:val="49197AF3"/>
     <w:multiLevelType w:val="hybridMultilevel"/>
     <w:tmpl w:val="9DD46390"/>
@@ -26099,7 +26898,7 @@
       </w:pPr>
     </w:lvl>
   </w:abstractNum>
-  <w:abstractNum w:abstractNumId="26" w15:restartNumberingAfterBreak="0">
+  <w:abstractNum w:abstractNumId="28" w15:restartNumberingAfterBreak="0">
     <w:nsid w:val="50906B50"/>
     <w:multiLevelType w:val="hybridMultilevel"/>
     <w:tmpl w:val="6D3E464A"/>
@@ -26212,7 +27011,7 @@
       </w:rPr>
     </w:lvl>
   </w:abstractNum>
-  <w:abstractNum w:abstractNumId="27" w15:restartNumberingAfterBreak="0">
+  <w:abstractNum w:abstractNumId="29" w15:restartNumberingAfterBreak="0">
     <w:nsid w:val="53E12998"/>
     <w:multiLevelType w:val="hybridMultilevel"/>
     <w:tmpl w:val="EDD47322"/>
@@ -26325,7 +27124,7 @@
       </w:rPr>
     </w:lvl>
   </w:abstractNum>
-  <w:abstractNum w:abstractNumId="28" w15:restartNumberingAfterBreak="0">
+  <w:abstractNum w:abstractNumId="30" w15:restartNumberingAfterBreak="0">
     <w:nsid w:val="54296620"/>
     <w:multiLevelType w:val="hybridMultilevel"/>
     <w:tmpl w:val="51D4AF58"/>
@@ -26438,7 +27237,7 @@
       </w:rPr>
     </w:lvl>
   </w:abstractNum>
-  <w:abstractNum w:abstractNumId="29" w15:restartNumberingAfterBreak="0">
+  <w:abstractNum w:abstractNumId="31" w15:restartNumberingAfterBreak="0">
     <w:nsid w:val="56374B9F"/>
     <w:multiLevelType w:val="hybridMultilevel"/>
     <w:tmpl w:val="9C6EC418"/>
@@ -26551,7 +27350,7 @@
       </w:rPr>
     </w:lvl>
   </w:abstractNum>
-  <w:abstractNum w:abstractNumId="30" w15:restartNumberingAfterBreak="0">
+  <w:abstractNum w:abstractNumId="32" w15:restartNumberingAfterBreak="0">
     <w:nsid w:val="59F01BC5"/>
     <w:multiLevelType w:val="hybridMultilevel"/>
     <w:tmpl w:val="1F4295A8"/>
@@ -26664,7 +27463,7 @@
       </w:rPr>
     </w:lvl>
   </w:abstractNum>
-  <w:abstractNum w:abstractNumId="31" w15:restartNumberingAfterBreak="0">
+  <w:abstractNum w:abstractNumId="33" w15:restartNumberingAfterBreak="0">
     <w:nsid w:val="607C35FE"/>
     <w:multiLevelType w:val="hybridMultilevel"/>
     <w:tmpl w:val="3DB601F4"/>
@@ -26777,7 +27576,7 @@
       </w:rPr>
     </w:lvl>
   </w:abstractNum>
-  <w:abstractNum w:abstractNumId="32" w15:restartNumberingAfterBreak="0">
+  <w:abstractNum w:abstractNumId="34" w15:restartNumberingAfterBreak="0">
     <w:nsid w:val="62064957"/>
     <w:multiLevelType w:val="hybridMultilevel"/>
     <w:tmpl w:val="A97A2886"/>
@@ -26890,7 +27689,7 @@
       </w:rPr>
     </w:lvl>
   </w:abstractNum>
-  <w:abstractNum w:abstractNumId="33" w15:restartNumberingAfterBreak="0">
+  <w:abstractNum w:abstractNumId="35" w15:restartNumberingAfterBreak="0">
     <w:nsid w:val="62E236E0"/>
     <w:multiLevelType w:val="hybridMultilevel"/>
     <w:tmpl w:val="D5A48EA6"/>
@@ -27003,7 +27802,7 @@
       </w:rPr>
     </w:lvl>
   </w:abstractNum>
-  <w:abstractNum w:abstractNumId="34" w15:restartNumberingAfterBreak="0">
+  <w:abstractNum w:abstractNumId="36" w15:restartNumberingAfterBreak="0">
     <w:nsid w:val="64D51068"/>
     <w:multiLevelType w:val="hybridMultilevel"/>
     <w:tmpl w:val="FCFA9A84"/>
@@ -27094,7 +27893,7 @@
       </w:pPr>
     </w:lvl>
   </w:abstractNum>
-  <w:abstractNum w:abstractNumId="35" w15:restartNumberingAfterBreak="0">
+  <w:abstractNum w:abstractNumId="37" w15:restartNumberingAfterBreak="0">
     <w:nsid w:val="65330F4F"/>
     <w:multiLevelType w:val="hybridMultilevel"/>
     <w:tmpl w:val="010C95C8"/>
@@ -27207,7 +28006,7 @@
       </w:rPr>
     </w:lvl>
   </w:abstractNum>
-  <w:abstractNum w:abstractNumId="36" w15:restartNumberingAfterBreak="0">
+  <w:abstractNum w:abstractNumId="38" w15:restartNumberingAfterBreak="0">
     <w:nsid w:val="65BA6D9A"/>
     <w:multiLevelType w:val="hybridMultilevel"/>
     <w:tmpl w:val="F8128F4C"/>
@@ -27320,7 +28119,7 @@
       </w:rPr>
     </w:lvl>
   </w:abstractNum>
-  <w:abstractNum w:abstractNumId="37" w15:restartNumberingAfterBreak="0">
+  <w:abstractNum w:abstractNumId="39" w15:restartNumberingAfterBreak="0">
     <w:nsid w:val="67FB5EAA"/>
     <w:multiLevelType w:val="hybridMultilevel"/>
     <w:tmpl w:val="D2C2FA20"/>
@@ -27433,7 +28232,7 @@
       </w:rPr>
     </w:lvl>
   </w:abstractNum>
-  <w:abstractNum w:abstractNumId="38" w15:restartNumberingAfterBreak="0">
+  <w:abstractNum w:abstractNumId="40" w15:restartNumberingAfterBreak="0">
     <w:nsid w:val="69C62B35"/>
     <w:multiLevelType w:val="hybridMultilevel"/>
     <w:tmpl w:val="AD007F0A"/>
@@ -27546,7 +28345,7 @@
       </w:rPr>
     </w:lvl>
   </w:abstractNum>
-  <w:abstractNum w:abstractNumId="39" w15:restartNumberingAfterBreak="0">
+  <w:abstractNum w:abstractNumId="41" w15:restartNumberingAfterBreak="0">
     <w:nsid w:val="6FB2533A"/>
     <w:multiLevelType w:val="hybridMultilevel"/>
     <w:tmpl w:val="265C1622"/>
@@ -27659,7 +28458,7 @@
       </w:rPr>
     </w:lvl>
   </w:abstractNum>
-  <w:abstractNum w:abstractNumId="40" w15:restartNumberingAfterBreak="0">
+  <w:abstractNum w:abstractNumId="42" w15:restartNumberingAfterBreak="0">
     <w:nsid w:val="73D74127"/>
     <w:multiLevelType w:val="hybridMultilevel"/>
     <w:tmpl w:val="73E46174"/>
@@ -27772,7 +28571,7 @@
       </w:rPr>
     </w:lvl>
   </w:abstractNum>
-  <w:abstractNum w:abstractNumId="41" w15:restartNumberingAfterBreak="0">
+  <w:abstractNum w:abstractNumId="43" w15:restartNumberingAfterBreak="0">
     <w:nsid w:val="756D39DE"/>
     <w:multiLevelType w:val="hybridMultilevel"/>
     <w:tmpl w:val="4C3C0014"/>
@@ -27885,7 +28684,7 @@
       </w:rPr>
     </w:lvl>
   </w:abstractNum>
-  <w:abstractNum w:abstractNumId="42" w15:restartNumberingAfterBreak="0">
+  <w:abstractNum w:abstractNumId="44" w15:restartNumberingAfterBreak="0">
     <w:nsid w:val="76A13F40"/>
     <w:multiLevelType w:val="hybridMultilevel"/>
     <w:tmpl w:val="8A28AE40"/>
@@ -27998,7 +28797,7 @@
       </w:rPr>
     </w:lvl>
   </w:abstractNum>
-  <w:abstractNum w:abstractNumId="43" w15:restartNumberingAfterBreak="0">
+  <w:abstractNum w:abstractNumId="45" w15:restartNumberingAfterBreak="0">
     <w:nsid w:val="78E708D2"/>
     <w:multiLevelType w:val="hybridMultilevel"/>
     <w:tmpl w:val="3920D09A"/>
@@ -28111,7 +28910,7 @@
       </w:rPr>
     </w:lvl>
   </w:abstractNum>
-  <w:abstractNum w:abstractNumId="44" w15:restartNumberingAfterBreak="0">
+  <w:abstractNum w:abstractNumId="46" w15:restartNumberingAfterBreak="0">
     <w:nsid w:val="7C08012D"/>
     <w:multiLevelType w:val="hybridMultilevel"/>
     <w:tmpl w:val="712C2978"/>
@@ -28224,7 +29023,7 @@
       </w:rPr>
     </w:lvl>
   </w:abstractNum>
-  <w:abstractNum w:abstractNumId="45" w15:restartNumberingAfterBreak="0">
+  <w:abstractNum w:abstractNumId="47" w15:restartNumberingAfterBreak="0">
     <w:nsid w:val="7F693639"/>
     <w:multiLevelType w:val="hybridMultilevel"/>
     <w:tmpl w:val="DCF061EC"/>
@@ -28338,25 +29137,25 @@
     </w:lvl>
   </w:abstractNum>
   <w:num w:numId="1" w16cid:durableId="1301378533">
-    <w:abstractNumId w:val="16"/>
+    <w:abstractNumId w:val="18"/>
   </w:num>
   <w:num w:numId="2" w16cid:durableId="1216090696">
-    <w:abstractNumId w:val="41"/>
+    <w:abstractNumId w:val="43"/>
   </w:num>
   <w:num w:numId="3" w16cid:durableId="1143933083">
-    <w:abstractNumId w:val="33"/>
+    <w:abstractNumId w:val="35"/>
   </w:num>
   <w:num w:numId="4" w16cid:durableId="379090341">
     <w:abstractNumId w:val="2"/>
   </w:num>
   <w:num w:numId="5" w16cid:durableId="1672678930">
-    <w:abstractNumId w:val="39"/>
+    <w:abstractNumId w:val="41"/>
   </w:num>
   <w:num w:numId="6" w16cid:durableId="520703883">
-    <w:abstractNumId w:val="27"/>
+    <w:abstractNumId w:val="29"/>
   </w:num>
   <w:num w:numId="7" w16cid:durableId="115415679">
-    <w:abstractNumId w:val="22"/>
+    <w:abstractNumId w:val="24"/>
   </w:num>
   <w:num w:numId="8" w16cid:durableId="931430024">
     <w:abstractNumId w:val="4"/>
@@ -28365,115 +29164,121 @@
     <w:abstractNumId w:val="1"/>
   </w:num>
   <w:num w:numId="10" w16cid:durableId="1705130326">
-    <w:abstractNumId w:val="37"/>
+    <w:abstractNumId w:val="39"/>
   </w:num>
   <w:num w:numId="11" w16cid:durableId="771435815">
-    <w:abstractNumId w:val="40"/>
+    <w:abstractNumId w:val="42"/>
   </w:num>
   <w:num w:numId="12" w16cid:durableId="1534996773">
-    <w:abstractNumId w:val="6"/>
+    <w:abstractNumId w:val="7"/>
   </w:num>
   <w:num w:numId="13" w16cid:durableId="63720590">
-    <w:abstractNumId w:val="20"/>
+    <w:abstractNumId w:val="22"/>
   </w:num>
   <w:num w:numId="14" w16cid:durableId="531769308">
-    <w:abstractNumId w:val="29"/>
+    <w:abstractNumId w:val="31"/>
   </w:num>
   <w:num w:numId="15" w16cid:durableId="1873304858">
     <w:abstractNumId w:val="0"/>
   </w:num>
   <w:num w:numId="16" w16cid:durableId="204684528">
-    <w:abstractNumId w:val="44"/>
+    <w:abstractNumId w:val="46"/>
   </w:num>
   <w:num w:numId="17" w16cid:durableId="1399398763">
-    <w:abstractNumId w:val="18"/>
+    <w:abstractNumId w:val="20"/>
   </w:num>
   <w:num w:numId="18" w16cid:durableId="279144317">
-    <w:abstractNumId w:val="35"/>
+    <w:abstractNumId w:val="37"/>
   </w:num>
   <w:num w:numId="19" w16cid:durableId="1560240668">
-    <w:abstractNumId w:val="7"/>
+    <w:abstractNumId w:val="8"/>
   </w:num>
   <w:num w:numId="20" w16cid:durableId="1333023394">
-    <w:abstractNumId w:val="32"/>
+    <w:abstractNumId w:val="34"/>
   </w:num>
   <w:num w:numId="21" w16cid:durableId="1556966288">
-    <w:abstractNumId w:val="19"/>
+    <w:abstractNumId w:val="21"/>
   </w:num>
   <w:num w:numId="22" w16cid:durableId="1851673138">
-    <w:abstractNumId w:val="9"/>
+    <w:abstractNumId w:val="10"/>
   </w:num>
   <w:num w:numId="23" w16cid:durableId="948393976">
     <w:abstractNumId w:val="5"/>
   </w:num>
   <w:num w:numId="24" w16cid:durableId="366151325">
+    <w:abstractNumId w:val="30"/>
+  </w:num>
+  <w:num w:numId="25" w16cid:durableId="1308441164">
+    <w:abstractNumId w:val="23"/>
+  </w:num>
+  <w:num w:numId="26" w16cid:durableId="1744138132">
+    <w:abstractNumId w:val="25"/>
+  </w:num>
+  <w:num w:numId="27" w16cid:durableId="950941188">
+    <w:abstractNumId w:val="27"/>
+  </w:num>
+  <w:num w:numId="28" w16cid:durableId="555042732">
     <w:abstractNumId w:val="28"/>
   </w:num>
-  <w:num w:numId="25" w16cid:durableId="1308441164">
-    <w:abstractNumId w:val="21"/>
+  <w:num w:numId="29" w16cid:durableId="256183794">
+    <w:abstractNumId w:val="13"/>
   </w:num>
-  <w:num w:numId="26" w16cid:durableId="1744138132">
-    <w:abstractNumId w:val="23"/>
-  </w:num>
-  <w:num w:numId="27" w16cid:durableId="950941188">
-    <w:abstractNumId w:val="25"/>
-  </w:num>
-  <w:num w:numId="28" w16cid:durableId="555042732">
-    <w:abstractNumId w:val="26"/>
-  </w:num>
-  <w:num w:numId="29" w16cid:durableId="256183794">
+  <w:num w:numId="30" w16cid:durableId="1396199897">
     <w:abstractNumId w:val="12"/>
   </w:num>
-  <w:num w:numId="30" w16cid:durableId="1396199897">
-    <w:abstractNumId w:val="11"/>
-  </w:num>
   <w:num w:numId="31" w16cid:durableId="1761100776">
-    <w:abstractNumId w:val="31"/>
+    <w:abstractNumId w:val="33"/>
   </w:num>
   <w:num w:numId="32" w16cid:durableId="210845980">
-    <w:abstractNumId w:val="45"/>
+    <w:abstractNumId w:val="47"/>
   </w:num>
   <w:num w:numId="33" w16cid:durableId="244415424">
-    <w:abstractNumId w:val="30"/>
+    <w:abstractNumId w:val="32"/>
   </w:num>
   <w:num w:numId="34" w16cid:durableId="373848333">
-    <w:abstractNumId w:val="17"/>
+    <w:abstractNumId w:val="19"/>
   </w:num>
   <w:num w:numId="35" w16cid:durableId="1866938912">
-    <w:abstractNumId w:val="14"/>
+    <w:abstractNumId w:val="15"/>
   </w:num>
   <w:num w:numId="36" w16cid:durableId="1075513857">
     <w:abstractNumId w:val="3"/>
   </w:num>
   <w:num w:numId="37" w16cid:durableId="185867612">
-    <w:abstractNumId w:val="42"/>
+    <w:abstractNumId w:val="44"/>
   </w:num>
   <w:num w:numId="38" w16cid:durableId="1304889511">
-    <w:abstractNumId w:val="13"/>
+    <w:abstractNumId w:val="14"/>
   </w:num>
   <w:num w:numId="39" w16cid:durableId="572349668">
+    <w:abstractNumId w:val="40"/>
+  </w:num>
+  <w:num w:numId="40" w16cid:durableId="1356888524">
+    <w:abstractNumId w:val="26"/>
+  </w:num>
+  <w:num w:numId="41" w16cid:durableId="371075047">
+    <w:abstractNumId w:val="45"/>
+  </w:num>
+  <w:num w:numId="42" w16cid:durableId="1905867672">
     <w:abstractNumId w:val="38"/>
   </w:num>
-  <w:num w:numId="40" w16cid:durableId="1356888524">
-    <w:abstractNumId w:val="24"/>
+  <w:num w:numId="43" w16cid:durableId="159547294">
+    <w:abstractNumId w:val="9"/>
   </w:num>
-  <w:num w:numId="41" w16cid:durableId="371075047">
-    <w:abstractNumId w:val="43"/>
+  <w:num w:numId="44" w16cid:durableId="687147689">
+    <w:abstractNumId w:val="16"/>
   </w:num>
-  <w:num w:numId="42" w16cid:durableId="1905867672">
+  <w:num w:numId="45" w16cid:durableId="2076080223">
+    <w:abstractNumId w:val="11"/>
+  </w:num>
+  <w:num w:numId="46" w16cid:durableId="448938711">
     <w:abstractNumId w:val="36"/>
   </w:num>
-  <w:num w:numId="43" w16cid:durableId="159547294">
-    <w:abstractNumId w:val="8"/>
+  <w:num w:numId="47" w16cid:durableId="1749108047">
+    <w:abstractNumId w:val="17"/>
   </w:num>
-  <w:num w:numId="44" w16cid:durableId="687147689">
-    <w:abstractNumId w:val="15"/>
-  </w:num>
-  <w:num w:numId="45" w16cid:durableId="2076080223">
-    <w:abstractNumId w:val="10"/>
-  </w:num>
-  <w:num w:numId="46" w16cid:durableId="448938711">
-    <w:abstractNumId w:val="34"/>
+  <w:num w:numId="48" w16cid:durableId="1801259795">
+    <w:abstractNumId w:val="6"/>
   </w:num>
 </w:numbering>
 </file>

</xml_diff>